<commit_message>
Updated the readme file and added the project task pdf
</commit_message>
<xml_diff>
--- a/Tasks.docx
+++ b/Tasks.docx
@@ -110,6 +110,33 @@
         </w:rPr>
         <w:t xml:space="preserve"> Repo link: </w:t>
       </w:r>
+      <w:hyperlink r:id="rId6" w:history="1">
+        <w:r>
+          <w:rPr>
+            <w:rStyle w:val="Hyperlink"/>
+            <w:rFonts w:ascii="Calibri-Bold" w:hAnsi="Calibri-Bold" w:cs="Calibri-Bold"/>
+            <w:b/>
+            <w:bCs/>
+            <w:sz w:val="28"/>
+            <w:szCs w:val="28"/>
+            <w:lang w:bidi="bn-BD"/>
+          </w:rPr>
+          <w:t>https://github.com/mhmridul24/BlockChain_Project1</w:t>
+        </w:r>
+      </w:hyperlink>
+      <w:r>
+        <w:rPr>
+          <w:rFonts w:ascii="Calibri-Bold" w:hAnsi="Calibri-Bold" w:cs="Calibri-Bold"/>
+          <w:b/>
+          <w:bCs/>
+          <w:sz w:val="28"/>
+          <w:szCs w:val="28"/>
+          <w:lang w:bidi="bn-BD"/>
+        </w:rPr>
+        <w:t xml:space="preserve"> </w:t>
+      </w:r>
+      <w:bookmarkStart w:id="0" w:name="_GoBack"/>
+      <w:bookmarkEnd w:id="0"/>
     </w:p>
     <w:p>
       <w:pPr>
@@ -203,7 +230,7 @@
           <w:noProof/>
         </w:rPr>
         <w:drawing>
-          <wp:anchor distT="0" distB="0" distL="114300" distR="114300" simplePos="0" relativeHeight="251658752" behindDoc="0" locked="0" layoutInCell="1" allowOverlap="1" wp14:anchorId="1EAF3C99" wp14:editId="789DE07F">
+          <wp:anchor distT="0" distB="0" distL="114300" distR="114300" simplePos="0" relativeHeight="251659776" behindDoc="0" locked="0" layoutInCell="1" allowOverlap="1" wp14:anchorId="1EAF3C99" wp14:editId="789DE07F">
             <wp:simplePos x="0" y="0"/>
             <wp:positionH relativeFrom="column">
               <wp:posOffset>800100</wp:posOffset>
@@ -224,7 +251,7 @@
             <wp:cNvGraphicFramePr/>
             <a:graphic xmlns:a="http://schemas.openxmlformats.org/drawingml/2006/main">
               <a:graphicData uri="http://schemas.openxmlformats.org/drawingml/2006/chart">
-                <c:chart xmlns:c="http://schemas.openxmlformats.org/drawingml/2006/chart" xmlns:r="http://schemas.openxmlformats.org/officeDocument/2006/relationships" r:id="rId6"/>
+                <c:chart xmlns:c="http://schemas.openxmlformats.org/drawingml/2006/chart" xmlns:r="http://schemas.openxmlformats.org/officeDocument/2006/relationships" r:id="rId7"/>
               </a:graphicData>
             </a:graphic>
           </wp:anchor>
@@ -556,7 +583,7 @@
             <wp:cNvGraphicFramePr/>
             <a:graphic xmlns:a="http://schemas.openxmlformats.org/drawingml/2006/main">
               <a:graphicData uri="http://schemas.openxmlformats.org/drawingml/2006/chart">
-                <c:chart xmlns:c="http://schemas.openxmlformats.org/drawingml/2006/chart" xmlns:r="http://schemas.openxmlformats.org/officeDocument/2006/relationships" r:id="rId7"/>
+                <c:chart xmlns:c="http://schemas.openxmlformats.org/drawingml/2006/chart" xmlns:r="http://schemas.openxmlformats.org/officeDocument/2006/relationships" r:id="rId8"/>
               </a:graphicData>
             </a:graphic>
           </wp:inline>
@@ -828,7 +855,7 @@
                     <pic:cNvPicPr/>
                   </pic:nvPicPr>
                   <pic:blipFill>
-                    <a:blip r:embed="rId8" cstate="print">
+                    <a:blip r:embed="rId9" cstate="print">
                       <a:extLst>
                         <a:ext uri="{28A0092B-C50C-407E-A947-70E740481C1C}">
                           <a14:useLocalDpi xmlns:a14="http://schemas.microsoft.com/office/drawing/2010/main" val="0"/>
@@ -1330,7 +1357,7 @@
             <wp:cNvGraphicFramePr/>
             <a:graphic xmlns:a="http://schemas.openxmlformats.org/drawingml/2006/main">
               <a:graphicData uri="http://schemas.openxmlformats.org/drawingml/2006/chart">
-                <c:chart xmlns:c="http://schemas.openxmlformats.org/drawingml/2006/chart" xmlns:r="http://schemas.openxmlformats.org/officeDocument/2006/relationships" r:id="rId9"/>
+                <c:chart xmlns:c="http://schemas.openxmlformats.org/drawingml/2006/chart" xmlns:r="http://schemas.openxmlformats.org/officeDocument/2006/relationships" r:id="rId10"/>
               </a:graphicData>
             </a:graphic>
           </wp:inline>
@@ -1373,8 +1400,6 @@
         <w:lastRenderedPageBreak/>
         <w:t>B.</w:t>
       </w:r>
-      <w:bookmarkStart w:id="0" w:name="_GoBack"/>
-      <w:bookmarkEnd w:id="0"/>
     </w:p>
     <w:p>
       <w:pPr>
@@ -3096,6 +3121,29 @@
       <w:ind w:left="720"/>
       <w:contextualSpacing/>
     </w:pPr>
+  </w:style>
+  <w:style w:type="character" w:styleId="Hyperlink">
+    <w:name w:val="Hyperlink"/>
+    <w:basedOn w:val="DefaultParagraphFont"/>
+    <w:uiPriority w:val="99"/>
+    <w:unhideWhenUsed/>
+    <w:rsid w:val="00FF2FAF"/>
+    <w:rPr>
+      <w:color w:val="0000FF" w:themeColor="hyperlink"/>
+      <w:u w:val="single"/>
+    </w:rPr>
+  </w:style>
+  <w:style w:type="character" w:styleId="UnresolvedMention">
+    <w:name w:val="Unresolved Mention"/>
+    <w:basedOn w:val="DefaultParagraphFont"/>
+    <w:uiPriority w:val="99"/>
+    <w:semiHidden/>
+    <w:unhideWhenUsed/>
+    <w:rsid w:val="00FF2FAF"/>
+    <w:rPr>
+      <w:color w:val="605E5C"/>
+      <w:shd w:val="clear" w:color="auto" w:fill="E1DFDD"/>
+    </w:rPr>
   </w:style>
 </w:styles>
 </file>
@@ -6169,7 +6217,7 @@
 </file>
 
 <file path=customXml/itemProps1.xml><?xml version="1.0" encoding="utf-8"?>
-<ds:datastoreItem xmlns:ds="http://schemas.openxmlformats.org/officeDocument/2006/customXml" ds:itemID="{CFB4CAEA-4E56-44AC-A850-264D5F0785F4}">
+<ds:datastoreItem xmlns:ds="http://schemas.openxmlformats.org/officeDocument/2006/customXml" ds:itemID="{9F82F352-8E98-49B1-9B50-6F92B0E9051A}">
   <ds:schemaRefs>
     <ds:schemaRef ds:uri="http://schemas.openxmlformats.org/officeDocument/2006/bibliography"/>
   </ds:schemaRefs>

</xml_diff>